<commit_message>
removed old files and organised better - added files for testing purposes
</commit_message>
<xml_diff>
--- a/Guide/Field Log User Guide.docx
+++ b/Guide/Field Log User Guide.docx
@@ -86,34 +86,32 @@
         <w:rPr>
           <w:lang w:val="en-GB"/>
         </w:rPr>
-        <w:t xml:space="preserve">The program launches with e </w:t>
+        <w:t xml:space="preserve">The program launches with </w:t>
+      </w:r>
+      <w:r>
+        <w:rPr>
+          <w:lang w:val="en-GB"/>
+        </w:rPr>
+        <w:t>a</w:t>
+      </w:r>
+      <w:r>
+        <w:rPr>
+          <w:lang w:val="en-GB"/>
+        </w:rPr>
+        <w:t xml:space="preserve"> cmd window. This is a debugging window to help you trace errors – it should be left open, if you close it then you will also close the </w:t>
       </w:r>
       <w:proofErr w:type="spellStart"/>
       <w:r>
         <w:rPr>
           <w:lang w:val="en-GB"/>
         </w:rPr>
-        <w:t>cmd</w:t>
+        <w:t>gui</w:t>
       </w:r>
       <w:proofErr w:type="spellEnd"/>
       <w:r>
         <w:rPr>
           <w:lang w:val="en-GB"/>
         </w:rPr>
-        <w:t xml:space="preserve"> window. This is a debugging window to help you trace errors – it should be left open, if you close it then you will also close the </w:t>
-      </w:r>
-      <w:proofErr w:type="spellStart"/>
-      <w:r>
-        <w:rPr>
-          <w:lang w:val="en-GB"/>
-        </w:rPr>
-        <w:t>gui</w:t>
-      </w:r>
-      <w:proofErr w:type="spellEnd"/>
-      <w:r>
-        <w:rPr>
-          <w:lang w:val="en-GB"/>
-        </w:rPr>
         <w:t xml:space="preserve">. </w:t>
       </w:r>
     </w:p>
@@ -128,7 +126,7 @@
           <w:lang w:val="en-GB"/>
         </w:rPr>
         <w:pict w14:anchorId="71BA90BE">
-          <v:rect id="_x0000_i1061" style="width:0;height:1.5pt" o:hralign="center" o:hrstd="t" o:hr="t" fillcolor="#a0a0a0" stroked="f"/>
+          <v:rect id="_x0000_i1025" style="width:0;height:1.5pt" o:hralign="center" o:hrstd="t" o:hr="t" fillcolor="#a0a0a0" stroked="f"/>
         </w:pict>
       </w:r>
     </w:p>
@@ -162,21 +160,34 @@
         <w:rPr>
           <w:lang w:val="en-GB"/>
         </w:rPr>
-        <w:t>Ensure you have a excel template setup with all the columns and headers you require. The headers must match the log program to work. IF you accidentally change or delete a header then the program will not know where to place the data and you will get an error.</w:t>
-      </w:r>
-    </w:p>
-    <w:p>
-      <w:pPr>
-        <w:rPr>
-          <w:lang w:val="en-GB"/>
-        </w:rPr>
-      </w:pPr>
-      <w:r>
-        <w:rPr>
+        <w:t>Ensure you have a excel template setup with all the columns and headers you require. The headers must match the log program to work. I</w:t>
+      </w:r>
+      <w:r>
+        <w:rPr>
+          <w:lang w:val="en-GB"/>
+        </w:rPr>
+        <w:t>f</w:t>
+      </w:r>
+      <w:r>
+        <w:rPr>
+          <w:lang w:val="en-GB"/>
+        </w:rPr>
+        <w:t xml:space="preserve"> you accidentally change or delete a header then the program will not know where to place the data and you will get an error.</w:t>
+      </w:r>
+    </w:p>
+    <w:p>
+      <w:pPr>
+        <w:rPr>
+          <w:lang w:val="en-GB"/>
+        </w:rPr>
+      </w:pPr>
+      <w:r>
+        <w:rPr>
+          <w:noProof/>
           <w:lang w:val="en-GB"/>
         </w:rPr>
         <w:drawing>
-          <wp:anchor distT="0" distB="0" distL="114300" distR="114300" simplePos="0" relativeHeight="251658240" behindDoc="0" locked="0" layoutInCell="1" allowOverlap="1" wp14:anchorId="05E4BC09" wp14:editId="466648FC">
+          <wp:anchor distT="0" distB="0" distL="114300" distR="114300" simplePos="0" relativeHeight="251658240" behindDoc="0" locked="0" layoutInCell="1" allowOverlap="1" wp14:anchorId="05E4BC09" wp14:editId="7700FFCB">
             <wp:simplePos x="0" y="0"/>
             <wp:positionH relativeFrom="column">
               <wp:posOffset>0</wp:posOffset>
@@ -896,7 +907,7 @@
           <w:lang w:val="en-GB"/>
         </w:rPr>
         <w:pict w14:anchorId="1D4FBBE4">
-          <v:rect id="_x0000_i1062" style="width:0;height:1.5pt" o:hralign="center" o:hrstd="t" o:hr="t" fillcolor="#a0a0a0" stroked="f"/>
+          <v:rect id="_x0000_i1026" style="width:0;height:1.5pt" o:hralign="center" o:hrstd="t" o:hr="t" fillcolor="#a0a0a0" stroked="f"/>
         </w:pict>
       </w:r>
     </w:p>
@@ -1107,6 +1118,20 @@
         <w:rPr>
           <w:lang w:val="en-GB"/>
         </w:rPr>
+        <w:t xml:space="preserve"> </w:t>
+      </w:r>
+      <w:proofErr w:type="spellStart"/>
+      <w:r>
+        <w:rPr>
+          <w:lang w:val="en-GB"/>
+        </w:rPr>
+        <w:t>db</w:t>
+      </w:r>
+      <w:proofErr w:type="spellEnd"/>
+      <w:r>
+        <w:rPr>
+          <w:lang w:val="en-GB"/>
+        </w:rPr>
         <w:t xml:space="preserve"> from the program – Reach horizon spreadsheets manage the writing to SQL so this can be used as a backup if there is an issue with that. The SQL is a mirror of the </w:t>
       </w:r>
       <w:proofErr w:type="gramStart"/>
@@ -1139,26 +1164,45 @@
         </w:rPr>
         <w:t xml:space="preserve"> event is logged it writes to excel and the SQL. Every X amount on minutes the DB is </w:t>
       </w:r>
-      <w:proofErr w:type="spellStart"/>
-      <w:r>
-        <w:rPr>
-          <w:lang w:val="en-GB"/>
-        </w:rPr>
-        <w:t>sysnced</w:t>
-      </w:r>
-      <w:proofErr w:type="spellEnd"/>
+      <w:r>
+        <w:rPr>
+          <w:lang w:val="en-GB"/>
+        </w:rPr>
+        <w:t>synced</w:t>
+      </w:r>
       <w:r>
         <w:rPr>
           <w:lang w:val="en-GB"/>
         </w:rPr>
         <w:t xml:space="preserve"> so any changes you made after the event button is pressed will be updated in the SQL – The UUID is the Primary key to know which row belongs to which in excel. </w:t>
       </w:r>
+      <w:r>
+        <w:rPr>
+          <w:lang w:val="en-GB"/>
+        </w:rPr>
+        <w:t xml:space="preserve">If you are running this at the same time as using a horizon workbook then the horizon will complain since each time a sync takes place to the SQL, the workbook becomes locked for a second – horizon will pop up a cmd window with an error. You can reduce the errors by </w:t>
+      </w:r>
+      <w:proofErr w:type="gramStart"/>
+      <w:r>
+        <w:rPr>
+          <w:lang w:val="en-GB"/>
+        </w:rPr>
+        <w:t>setting  the</w:t>
+      </w:r>
+      <w:proofErr w:type="gramEnd"/>
+      <w:r>
+        <w:rPr>
+          <w:lang w:val="en-GB"/>
+        </w:rPr>
+        <w:t xml:space="preserve"> automatic sync interval higher. </w:t>
+      </w:r>
     </w:p>
     <w:p>
       <w:pPr>
         <w:pStyle w:val="Heading3"/>
       </w:pPr>
       <w:r>
+        <w:lastRenderedPageBreak/>
         <w:t>Navigation TXT Data Sources</w:t>
       </w:r>
     </w:p>
@@ -1203,7 +1247,6 @@
         <w:rPr>
           <w:lang w:val="en-GB"/>
         </w:rPr>
-        <w:lastRenderedPageBreak/>
         <w:t xml:space="preserve">In the </w:t>
       </w:r>
       <w:r>
@@ -1330,6 +1373,23 @@
     </w:p>
     <w:p>
       <w:pPr>
+        <w:numPr>
+          <w:ilvl w:val="0"/>
+          <w:numId w:val="2"/>
+        </w:numPr>
+        <w:rPr>
+          <w:lang w:val="en-GB"/>
+        </w:rPr>
+      </w:pPr>
+      <w:r>
+        <w:rPr>
+          <w:lang w:val="en-GB"/>
+        </w:rPr>
+        <w:t xml:space="preserve">The program uses the folder location you select to find the latest file and then the latest line in that file – For example in Qinsy you set the log file to create a new one each day, so you just point it at the parent directory and it will search in there for the latest file and pull the latest line. </w:t>
+      </w:r>
+    </w:p>
+    <w:p>
+      <w:pPr>
         <w:pStyle w:val="Heading3"/>
       </w:pPr>
       <w:r>
@@ -1515,6 +1575,12 @@
         </w:rPr>
         <w:t>).</w:t>
       </w:r>
+      <w:r>
+        <w:rPr>
+          <w:lang w:val="en-GB"/>
+        </w:rPr>
+        <w:t xml:space="preserve"> This is case sensitive so make sure you match the header exactly.</w:t>
+      </w:r>
     </w:p>
     <w:p>
       <w:pPr>
@@ -1639,6 +1705,7 @@
         <w:rPr>
           <w:lang w:val="en-GB"/>
         </w:rPr>
+        <w:lastRenderedPageBreak/>
         <w:t xml:space="preserve">You can define the mapping for each individual text file, or if they are they same you can press the </w:t>
       </w:r>
       <w:r>
@@ -1683,7 +1750,7 @@
           <w:lang w:val="en-GB"/>
         </w:rPr>
         <w:pict w14:anchorId="62E52A89">
-          <v:rect id="_x0000_i1076" style="width:0;height:1.5pt" o:hralign="center" o:hrstd="t" o:hr="t" fillcolor="#a0a0a0" stroked="f"/>
+          <v:rect id="_x0000_i1027" style="width:0;height:1.5pt" o:hralign="center" o:hrstd="t" o:hr="t" fillcolor="#a0a0a0" stroked="f"/>
         </w:pict>
       </w:r>
     </w:p>
@@ -1698,7 +1765,6 @@
         <w:rPr>
           <w:lang w:val="en-GB"/>
         </w:rPr>
-        <w:lastRenderedPageBreak/>
         <w:t>Generated Fields</w:t>
       </w:r>
     </w:p>
@@ -1713,7 +1779,13 @@
         <w:rPr>
           <w:lang w:val="en-GB"/>
         </w:rPr>
-        <w:t xml:space="preserve">These are fields that the program generates itself – these need to have excel headers for each one to work – Its important you have these in each the header for it to work correctly </w:t>
+        <w:t xml:space="preserve">These are fields that the program generates itself – these need to have excel headers for each one to work – </w:t>
+      </w:r>
+      <w:r>
+        <w:rPr>
+          <w:lang w:val="en-GB"/>
+        </w:rPr>
+        <w:t xml:space="preserve">It is critical to have the header in excel for these to work. </w:t>
       </w:r>
     </w:p>
     <w:p>
@@ -1729,7 +1801,7 @@
           <w:lang w:val="en-GB"/>
         </w:rPr>
         <w:pict w14:anchorId="79D07B90">
-          <v:rect id="_x0000_i1077" style="width:0;height:1.5pt" o:hralign="center" o:hrstd="t" o:hr="t" fillcolor="#a0a0a0" stroked="f"/>
+          <v:rect id="_x0000_i1028" style="width:0;height:1.5pt" o:hralign="center" o:hrstd="t" o:hr="t" fillcolor="#a0a0a0" stroked="f"/>
         </w:pict>
       </w:r>
     </w:p>
@@ -1799,7 +1871,7 @@
           <w:lang w:val="en-GB"/>
         </w:rPr>
         <w:pict w14:anchorId="0C89A894">
-          <v:rect id="_x0000_i1074" style="width:0;height:1.5pt" o:hralign="center" o:hrstd="t" o:hr="t" fillcolor="#a0a0a0" stroked="f"/>
+          <v:rect id="_x0000_i1029" style="width:0;height:1.5pt" o:hralign="center" o:hrstd="t" o:hr="t" fillcolor="#a0a0a0" stroked="f"/>
         </w:pict>
       </w:r>
     </w:p>
@@ -1882,7 +1954,19 @@
         <w:rPr>
           <w:lang w:val="en-GB"/>
         </w:rPr>
-        <w:t xml:space="preserve"> logging in the last 15 seconds. If are testing that it works before actually logging </w:t>
+        <w:t xml:space="preserve"> logging in the last 15 seconds. If </w:t>
+      </w:r>
+      <w:r>
+        <w:rPr>
+          <w:lang w:val="en-GB"/>
+        </w:rPr>
+        <w:t xml:space="preserve">you </w:t>
+      </w:r>
+      <w:r>
+        <w:rPr>
+          <w:lang w:val="en-GB"/>
+        </w:rPr>
+        <w:t xml:space="preserve">are testing that it works before actually logging </w:t>
       </w:r>
       <w:proofErr w:type="gramStart"/>
       <w:r>
@@ -1924,7 +2008,32 @@
         <w:rPr>
           <w:lang w:val="en-GB"/>
         </w:rPr>
-        <w:t xml:space="preserve"> it considers the logging as inactive. IT works as a QC to ensure you are logging but also stop the log being filled with a file </w:t>
+        <w:t xml:space="preserve"> it considers the logging as inactive. </w:t>
+      </w:r>
+    </w:p>
+    <w:p>
+      <w:pPr>
+        <w:rPr>
+          <w:lang w:val="en-GB"/>
+        </w:rPr>
+      </w:pPr>
+      <w:r>
+        <w:rPr>
+          <w:lang w:val="en-GB"/>
+        </w:rPr>
+        <w:t>I</w:t>
+      </w:r>
+      <w:r>
+        <w:rPr>
+          <w:lang w:val="en-GB"/>
+        </w:rPr>
+        <w:t>t</w:t>
+      </w:r>
+      <w:r>
+        <w:rPr>
+          <w:lang w:val="en-GB"/>
+        </w:rPr>
+        <w:t xml:space="preserve"> works as a QC to ensure you are logging but also stop the log being filled with a file </w:t>
       </w:r>
       <w:proofErr w:type="gramStart"/>
       <w:r>
@@ -1939,6 +2048,12 @@
           <w:lang w:val="en-GB"/>
         </w:rPr>
         <w:t xml:space="preserve"> you are not actually logging that file for the current task. </w:t>
+      </w:r>
+      <w:r>
+        <w:rPr>
+          <w:lang w:val="en-GB"/>
+        </w:rPr>
+        <w:t xml:space="preserve">SVP is exempt from this since its not logging all the time while online </w:t>
       </w:r>
     </w:p>
     <w:p>
@@ -2079,6 +2194,7 @@
         <w:rPr>
           <w:lang w:val="en-GB"/>
         </w:rPr>
+        <w:lastRenderedPageBreak/>
         <w:t xml:space="preserve">Set the </w:t>
       </w:r>
       <w:r>
@@ -2095,22 +2211,34 @@
         </w:rPr>
         <w:t xml:space="preserve"> (e.g., </w:t>
       </w:r>
-      <w:proofErr w:type="spellStart"/>
       <w:r>
         <w:rPr>
           <w:b/>
           <w:bCs/>
           <w:lang w:val="en-GB"/>
         </w:rPr>
-        <w:t>svp</w:t>
+        <w:t>npd</w:t>
+      </w:r>
+      <w:r>
+        <w:rPr>
+          <w:lang w:val="en-GB"/>
+        </w:rPr>
+        <w:t>). Leave blank to track any file in the folder.</w:t>
+      </w:r>
+      <w:r>
+        <w:rPr>
+          <w:lang w:val="en-GB"/>
+        </w:rPr>
+        <w:t xml:space="preserve"> This ensures that the log only pulls the file type you are interested in, such </w:t>
+      </w:r>
+      <w:proofErr w:type="spellStart"/>
+      <w:r>
+        <w:rPr>
+          <w:lang w:val="en-GB"/>
+        </w:rPr>
+        <w:t>as.npd</w:t>
       </w:r>
       <w:proofErr w:type="spellEnd"/>
-      <w:r>
-        <w:rPr>
-          <w:lang w:val="en-GB"/>
-        </w:rPr>
-        <w:t>). Leave blank to track any file in the folder.</w:t>
-      </w:r>
     </w:p>
     <w:p>
       <w:pPr>
@@ -2171,13 +2299,74 @@
           <w:lang w:val="en-GB"/>
         </w:rPr>
       </w:pPr>
-      <w:proofErr w:type="gramStart"/>
       <w:r>
         <w:rPr>
           <w:b/>
           <w:bCs/>
           <w:lang w:val="en-GB"/>
         </w:rPr>
+        <w:t>Log Ext:</w:t>
+      </w:r>
+      <w:r>
+        <w:rPr>
+          <w:lang w:val="en-GB"/>
+        </w:rPr>
+        <w:t xml:space="preserve"> This logs the file extension – for the SBD files the name can make excel think the format should be in scientific format so it doesn’t display correctly. Having </w:t>
+      </w:r>
+      <w:proofErr w:type="gramStart"/>
+      <w:r>
+        <w:rPr>
+          <w:lang w:val="en-GB"/>
+        </w:rPr>
+        <w:t>the .</w:t>
+      </w:r>
+      <w:proofErr w:type="spellStart"/>
+      <w:r>
+        <w:rPr>
+          <w:lang w:val="en-GB"/>
+        </w:rPr>
+        <w:t>sbd</w:t>
+      </w:r>
+      <w:proofErr w:type="spellEnd"/>
+      <w:proofErr w:type="gramEnd"/>
+      <w:r>
+        <w:rPr>
+          <w:lang w:val="en-GB"/>
+        </w:rPr>
+        <w:t xml:space="preserve"> at the end negates this. But you can do this to any monitored folder to make sure that </w:t>
+      </w:r>
+      <w:proofErr w:type="gramStart"/>
+      <w:r>
+        <w:rPr>
+          <w:lang w:val="en-GB"/>
+        </w:rPr>
+        <w:t>its</w:t>
+      </w:r>
+      <w:proofErr w:type="gramEnd"/>
+      <w:r>
+        <w:rPr>
+          <w:lang w:val="en-GB"/>
+        </w:rPr>
+        <w:t xml:space="preserve"> getting the correct file </w:t>
+      </w:r>
+    </w:p>
+    <w:p>
+      <w:pPr>
+        <w:numPr>
+          <w:ilvl w:val="1"/>
+          <w:numId w:val="4"/>
+        </w:numPr>
+        <w:rPr>
+          <w:lang w:val="en-GB"/>
+        </w:rPr>
+      </w:pPr>
+      <w:proofErr w:type="gramStart"/>
+      <w:r>
+        <w:rPr>
+          <w:b/>
+          <w:bCs/>
+          <w:lang w:val="en-GB"/>
+        </w:rPr>
         <w:t>Skip?:</w:t>
       </w:r>
       <w:proofErr w:type="gramEnd"/>
@@ -2199,7 +2388,7 @@
           <w:lang w:val="en-GB"/>
         </w:rPr>
         <w:pict w14:anchorId="585C9CBF">
-          <v:rect id="_x0000_i1064" style="width:0;height:1.5pt" o:hralign="center" o:hrstd="t" o:hr="t" fillcolor="#a0a0a0" stroked="f"/>
+          <v:rect id="_x0000_i1030" style="width:0;height:1.5pt" o:hralign="center" o:hrstd="t" o:hr="t" fillcolor="#a0a0a0" stroked="f"/>
         </w:pict>
       </w:r>
     </w:p>
@@ -2214,7 +2403,6 @@
         <w:rPr>
           <w:lang w:val="en-GB"/>
         </w:rPr>
-        <w:lastRenderedPageBreak/>
         <w:t>Customize Event Buttons (Button Configuration Tab)</w:t>
       </w:r>
     </w:p>
@@ -2229,6 +2417,26 @@
           <w:lang w:val="en-GB"/>
         </w:rPr>
         <w:t>You can define up to 50 custom event buttons for quick logging.</w:t>
+      </w:r>
+      <w:r>
+        <w:rPr>
+          <w:lang w:val="en-GB"/>
+        </w:rPr>
+        <w:t xml:space="preserve"> Each button can be edited by right clicking it in the GUI, but you can get </w:t>
+      </w:r>
+      <w:proofErr w:type="gramStart"/>
+      <w:r>
+        <w:rPr>
+          <w:lang w:val="en-GB"/>
+        </w:rPr>
+        <w:t>a</w:t>
+      </w:r>
+      <w:proofErr w:type="gramEnd"/>
+      <w:r>
+        <w:rPr>
+          <w:lang w:val="en-GB"/>
+        </w:rPr>
+        <w:t xml:space="preserve"> overview here of all buttons to make changes</w:t>
       </w:r>
     </w:p>
     <w:p>
@@ -2447,7 +2655,7 @@
         <w:rPr>
           <w:lang w:val="en-GB"/>
         </w:rPr>
-        <w:t xml:space="preserve"> Enter a name to group buttons onto a separate tab on the main window (e.g., "WROV Events").</w:t>
+        <w:t xml:space="preserve"> Enter a name to group buttons onto a separate tab on the main window (e.g., "WROV").</w:t>
       </w:r>
     </w:p>
     <w:p>
@@ -2479,7 +2687,7 @@
           <w:lang w:val="en-GB"/>
         </w:rPr>
         <w:pict w14:anchorId="73F61F87">
-          <v:rect id="_x0000_i1065" style="width:0;height:1.5pt" o:hralign="center" o:hrstd="t" o:hr="t" fillcolor="#a0a0a0" stroked="f"/>
+          <v:rect id="_x0000_i1031" style="width:0;height:1.5pt" o:hralign="center" o:hrstd="t" o:hr="t" fillcolor="#a0a0a0" stroked="f"/>
         </w:pict>
       </w:r>
     </w:p>
@@ -2494,6 +2702,7 @@
         <w:rPr>
           <w:lang w:val="en-GB"/>
         </w:rPr>
+        <w:lastRenderedPageBreak/>
         <w:t>Event Code</w:t>
       </w:r>
     </w:p>
@@ -2634,14 +2843,7 @@
         <w:rPr>
           <w:lang w:val="en-GB"/>
         </w:rPr>
-        <w:t xml:space="preserve"> up the process of logging data because it only needs to look at 5 files </w:t>
-      </w:r>
-      <w:r>
-        <w:rPr>
-          <w:lang w:val="en-GB"/>
-        </w:rPr>
-        <w:lastRenderedPageBreak/>
-        <w:t xml:space="preserve">rather than all the files in the folder. The initial start monitoring may take a while if you have lots of folder to </w:t>
+        <w:t xml:space="preserve"> up the process of logging data because it only needs to look at 5 files rather than all the files in the folder. The initial start monitoring may take a while if you have lots of folder to </w:t>
       </w:r>
       <w:proofErr w:type="gramStart"/>
       <w:r>
@@ -2701,6 +2903,23 @@
           <w:lang w:val="en-GB"/>
         </w:rPr>
         <w:t xml:space="preserve"> (green), and the status bar at the bottom should update. This initiates the background process that scans the monitored folders.</w:t>
+      </w:r>
+    </w:p>
+    <w:p>
+      <w:pPr>
+        <w:numPr>
+          <w:ilvl w:val="0"/>
+          <w:numId w:val="6"/>
+        </w:numPr>
+        <w:rPr>
+          <w:lang w:val="en-GB"/>
+        </w:rPr>
+      </w:pPr>
+      <w:r>
+        <w:rPr>
+          <w:lang w:val="en-GB"/>
+        </w:rPr>
+        <w:t xml:space="preserve">If you change a directory or want to monitor a new directory then you need to stop monitoring, add/change a file path you want, then start monitoring again. </w:t>
       </w:r>
     </w:p>
     <w:p>
@@ -2807,6 +3026,12 @@
         </w:rPr>
         <w:t xml:space="preserve">. </w:t>
       </w:r>
+      <w:r>
+        <w:rPr>
+          <w:lang w:val="en-GB"/>
+        </w:rPr>
+        <w:t xml:space="preserve">This only works if you have the KP column populated with data – if not then it will not return anything </w:t>
+      </w:r>
     </w:p>
     <w:p>
       <w:pPr>
@@ -2825,6 +3050,40 @@
         </w:rPr>
         <w:t>Log off distance/speed calculation – this looks at the time and KP of the last log on when you log off and automatically fills the cell with the distance covered and the average speed.</w:t>
       </w:r>
+      <w:r>
+        <w:rPr>
+          <w:lang w:val="en-GB"/>
+        </w:rPr>
+        <w:t xml:space="preserve"> If there isn’t a KP associated with log on and log </w:t>
+      </w:r>
+      <w:proofErr w:type="gramStart"/>
+      <w:r>
+        <w:rPr>
+          <w:lang w:val="en-GB"/>
+        </w:rPr>
+        <w:t>off</w:t>
+      </w:r>
+      <w:proofErr w:type="gramEnd"/>
+      <w:r>
+        <w:rPr>
+          <w:lang w:val="en-GB"/>
+        </w:rPr>
+        <w:t xml:space="preserve"> then the function won’t be </w:t>
+      </w:r>
+      <w:proofErr w:type="gramStart"/>
+      <w:r>
+        <w:rPr>
+          <w:lang w:val="en-GB"/>
+        </w:rPr>
+        <w:t>called</w:t>
+      </w:r>
+      <w:proofErr w:type="gramEnd"/>
+      <w:r>
+        <w:rPr>
+          <w:lang w:val="en-GB"/>
+        </w:rPr>
+        <w:t xml:space="preserve"> and it will just say Log off </w:t>
+      </w:r>
     </w:p>
     <w:p>
       <w:pPr>
@@ -2837,16 +3096,15 @@
         <w:rPr>
           <w:lang w:val="en-GB"/>
         </w:rPr>
+        <w:lastRenderedPageBreak/>
         <w:t xml:space="preserve"> </w:t>
       </w:r>
-      <w:proofErr w:type="spellStart"/>
-      <w:r>
-        <w:rPr>
-          <w:lang w:val="en-GB"/>
-        </w:rPr>
-        <w:t>Timezone</w:t>
-      </w:r>
-      <w:proofErr w:type="spellEnd"/>
+      <w:r>
+        <w:rPr>
+          <w:lang w:val="en-GB"/>
+        </w:rPr>
+        <w:t>Time zone</w:t>
+      </w:r>
       <w:r>
         <w:rPr>
           <w:lang w:val="en-GB"/>
@@ -3016,7 +3274,6 @@
           <w:bCs/>
           <w:lang w:val="en-GB"/>
         </w:rPr>
-        <w:lastRenderedPageBreak/>
         <w:t>SVP:</w:t>
       </w:r>
       <w:r>
@@ -3203,6 +3460,7 @@
         <w:rPr>
           <w:lang w:val="en-GB"/>
         </w:rPr>
+        <w:lastRenderedPageBreak/>
         <w:t xml:space="preserve">Make your changes in the small dialog, then click </w:t>
       </w:r>
       <w:r>
@@ -3231,7 +3489,7 @@
           <w:lang w:val="en-GB"/>
         </w:rPr>
         <w:pict w14:anchorId="44247D92">
-          <v:rect id="_x0000_i1066" style="width:0;height:1.5pt" o:hralign="center" o:hrstd="t" o:hr="t" fillcolor="#a0a0a0" stroked="f"/>
+          <v:rect id="_x0000_i1032" style="width:0;height:1.5pt" o:hralign="center" o:hrstd="t" o:hr="t" fillcolor="#a0a0a0" stroked="f"/>
         </w:pict>
       </w:r>
     </w:p>
@@ -5500,6 +5758,7 @@
   <w:style w:type="character" w:default="1" w:styleId="DefaultParagraphFont">
     <w:name w:val="Default Paragraph Font"/>
     <w:uiPriority w:val="1"/>
+    <w:semiHidden/>
     <w:unhideWhenUsed/>
   </w:style>
   <w:style w:type="table" w:default="1" w:styleId="TableNormal">

</xml_diff>

<commit_message>
New interface to manage the project settings created:  - New tab for Browsing, Loading, Saving, Renaming and Restoring the project settings. Now the project settings can be changed just selecting a file. No more dependency on custom_settings and default_settings  - Event codes and settings merged together in only one JSON per project  - Last_project and blank_project saved in /settings/config  - Blank_project created as a default template  - Several project settings (TEST_VIRE, TEST_DECY, VIRE_20251023, etc) created as a example - custom_settings and default_settings
</commit_message>
<xml_diff>
--- a/Guide/Field Log User Guide.docx
+++ b/Guide/Field Log User Guide.docx
@@ -59,21 +59,7 @@
         <w:rPr>
           <w:lang w:val="en-GB"/>
         </w:rPr>
-        <w:t xml:space="preserve">Much of the setting changes can be done once setup through the GUI by right clicking. Things like adding buttons, editing buttons, adding tabs of buttons and such can all be done by right clicking at various points in the </w:t>
-      </w:r>
-      <w:proofErr w:type="spellStart"/>
-      <w:r>
-        <w:rPr>
-          <w:lang w:val="en-GB"/>
-        </w:rPr>
-        <w:t>gui</w:t>
-      </w:r>
-      <w:proofErr w:type="spellEnd"/>
-      <w:r>
-        <w:rPr>
-          <w:lang w:val="en-GB"/>
-        </w:rPr>
-        <w:t xml:space="preserve">. </w:t>
+        <w:t xml:space="preserve">Much of the setting changes can be done once setup through the GUI by right clicking. Things like adding buttons, editing buttons, adding tabs of buttons and such can all be done by right clicking at various points in the gui. </w:t>
       </w:r>
     </w:p>
     <w:p>
@@ -98,21 +84,7 @@
         <w:rPr>
           <w:lang w:val="en-GB"/>
         </w:rPr>
-        <w:t xml:space="preserve"> cmd window. This is a debugging window to help you trace errors – it should be left open, if you close it then you will also close the </w:t>
-      </w:r>
-      <w:proofErr w:type="spellStart"/>
-      <w:r>
-        <w:rPr>
-          <w:lang w:val="en-GB"/>
-        </w:rPr>
-        <w:t>gui</w:t>
-      </w:r>
-      <w:proofErr w:type="spellEnd"/>
-      <w:r>
-        <w:rPr>
-          <w:lang w:val="en-GB"/>
-        </w:rPr>
-        <w:t xml:space="preserve">. </w:t>
+        <w:t xml:space="preserve"> cmd window. This is a debugging window to help you trace errors – it should be left open, if you close it then you will also close the gui. </w:t>
       </w:r>
     </w:p>
     <w:p>
@@ -187,7 +159,7 @@
           <w:lang w:val="en-GB"/>
         </w:rPr>
         <w:drawing>
-          <wp:anchor distT="0" distB="0" distL="114300" distR="114300" simplePos="0" relativeHeight="251658240" behindDoc="0" locked="0" layoutInCell="1" allowOverlap="1" wp14:anchorId="05E4BC09" wp14:editId="7700FFCB">
+          <wp:anchor distT="0" distB="0" distL="114300" distR="114300" simplePos="0" relativeHeight="251658240" behindDoc="0" locked="0" layoutInCell="1" allowOverlap="1" wp14:anchorId="05E4BC09" wp14:editId="20AF06ED">
             <wp:simplePos x="0" y="0"/>
             <wp:positionH relativeFrom="column">
               <wp:posOffset>0</wp:posOffset>
@@ -797,7 +769,6 @@
                 <w:lang w:val="en-GB"/>
               </w:rPr>
             </w:pPr>
-            <w:proofErr w:type="spellStart"/>
             <w:r>
               <w:rPr>
                 <w:b/>
@@ -806,7 +777,6 @@
               </w:rPr>
               <w:t>Timezone</w:t>
             </w:r>
-            <w:proofErr w:type="spellEnd"/>
           </w:p>
         </w:tc>
         <w:tc>
@@ -1058,18 +1028,8 @@
           <w:bCs/>
           <w:lang w:val="en-GB"/>
         </w:rPr>
-        <w:t>.</w:t>
-      </w:r>
-      <w:proofErr w:type="spellStart"/>
-      <w:r>
-        <w:rPr>
-          <w:b/>
-          <w:bCs/>
-          <w:lang w:val="en-GB"/>
-        </w:rPr>
-        <w:t>xlsb</w:t>
-      </w:r>
-      <w:proofErr w:type="spellEnd"/>
+        <w:t>.xlsb</w:t>
+      </w:r>
       <w:r>
         <w:rPr>
           <w:lang w:val="en-GB"/>
@@ -1104,65 +1064,19 @@
         <w:rPr>
           <w:lang w:val="en-GB"/>
         </w:rPr>
-        <w:t xml:space="preserve">This is optional and does not need to be used if you don’t want to write to an </w:t>
-      </w:r>
-      <w:proofErr w:type="spellStart"/>
-      <w:r>
-        <w:rPr>
-          <w:lang w:val="en-GB"/>
-        </w:rPr>
-        <w:t>SQlite</w:t>
-      </w:r>
-      <w:proofErr w:type="spellEnd"/>
-      <w:r>
-        <w:rPr>
-          <w:lang w:val="en-GB"/>
-        </w:rPr>
-        <w:t xml:space="preserve"> </w:t>
-      </w:r>
-      <w:proofErr w:type="spellStart"/>
-      <w:r>
-        <w:rPr>
-          <w:lang w:val="en-GB"/>
-        </w:rPr>
-        <w:t>db</w:t>
-      </w:r>
-      <w:proofErr w:type="spellEnd"/>
-      <w:r>
-        <w:rPr>
-          <w:lang w:val="en-GB"/>
-        </w:rPr>
-        <w:t xml:space="preserve"> from the program – Reach horizon spreadsheets manage the writing to SQL so this can be used as a backup if there is an issue with that. The SQL is a mirror of the </w:t>
-      </w:r>
-      <w:proofErr w:type="gramStart"/>
-      <w:r>
-        <w:rPr>
-          <w:lang w:val="en-GB"/>
-        </w:rPr>
-        <w:t>excel</w:t>
-      </w:r>
-      <w:proofErr w:type="gramEnd"/>
-      <w:r>
-        <w:rPr>
-          <w:lang w:val="en-GB"/>
-        </w:rPr>
-        <w:t xml:space="preserve"> workbook. It will take the headers from excel to make the table and then each time </w:t>
-      </w:r>
-      <w:proofErr w:type="spellStart"/>
-      <w:proofErr w:type="gramStart"/>
-      <w:r>
-        <w:rPr>
-          <w:lang w:val="en-GB"/>
-        </w:rPr>
-        <w:t>a</w:t>
-      </w:r>
-      <w:proofErr w:type="spellEnd"/>
-      <w:proofErr w:type="gramEnd"/>
-      <w:r>
-        <w:rPr>
-          <w:lang w:val="en-GB"/>
-        </w:rPr>
-        <w:t xml:space="preserve"> event is logged it writes to excel and the SQL. Every X amount on minutes the DB is </w:t>
+        <w:t>This is optional and does not need to be used if you don’t want to write to an SQlite</w:t>
+      </w:r>
+      <w:r>
+        <w:rPr>
+          <w:lang w:val="en-GB"/>
+        </w:rPr>
+        <w:t xml:space="preserve"> db</w:t>
+      </w:r>
+      <w:r>
+        <w:rPr>
+          <w:lang w:val="en-GB"/>
+        </w:rPr>
+        <w:t xml:space="preserve"> from the program – Reach horizon spreadsheets manage the writing to SQL so this can be used as a backup if there is an issue with that. The SQL is a mirror of the excel workbook. It will take the headers from excel to make the table and then each time a event is logged it writes to excel and the SQL. Every X amount on minutes the DB is </w:t>
       </w:r>
       <w:r>
         <w:rPr>
@@ -1180,21 +1094,7 @@
         <w:rPr>
           <w:lang w:val="en-GB"/>
         </w:rPr>
-        <w:t xml:space="preserve">If you are running this at the same time as using a horizon workbook then the horizon will complain since each time a sync takes place to the SQL, the workbook becomes locked for a second – horizon will pop up a cmd window with an error. You can reduce the errors by </w:t>
-      </w:r>
-      <w:proofErr w:type="gramStart"/>
-      <w:r>
-        <w:rPr>
-          <w:lang w:val="en-GB"/>
-        </w:rPr>
-        <w:t>setting  the</w:t>
-      </w:r>
-      <w:proofErr w:type="gramEnd"/>
-      <w:r>
-        <w:rPr>
-          <w:lang w:val="en-GB"/>
-        </w:rPr>
-        <w:t xml:space="preserve"> automatic sync interval higher. </w:t>
+        <w:t xml:space="preserve">If you are running this at the same time as using a horizon workbook then the horizon will complain since each time a sync takes place to the SQL, the workbook becomes locked for a second – horizon will pop up a cmd window with an error. You can reduce the errors by setting  the automatic sync interval higher. </w:t>
       </w:r>
     </w:p>
     <w:p>
@@ -1306,21 +1206,7 @@
         <w:rPr>
           <w:lang w:val="en-GB"/>
         </w:rPr>
-        <w:t>Select the folder where your primary navigation .txt</w:t>
-      </w:r>
-      <w:proofErr w:type="gramStart"/>
-      <w:r>
-        <w:rPr>
-          <w:lang w:val="en-GB"/>
-        </w:rPr>
-        <w:t>, .npd</w:t>
-      </w:r>
-      <w:proofErr w:type="gramEnd"/>
-      <w:r>
-        <w:rPr>
-          <w:lang w:val="en-GB"/>
-        </w:rPr>
-        <w:t>, or .csv files are saved.</w:t>
+        <w:t>Select the folder where your primary navigation .txt, .npd, or .csv files are saved.</w:t>
       </w:r>
     </w:p>
     <w:p>
@@ -1592,7 +1478,6 @@
           <w:lang w:val="en-GB"/>
         </w:rPr>
       </w:pPr>
-      <w:proofErr w:type="gramStart"/>
       <w:r>
         <w:rPr>
           <w:b/>
@@ -1601,7 +1486,6 @@
         </w:rPr>
         <w:t>Skip?:</w:t>
       </w:r>
-      <w:proofErr w:type="gramEnd"/>
       <w:r>
         <w:rPr>
           <w:lang w:val="en-GB"/>
@@ -1720,21 +1604,7 @@
         <w:rPr>
           <w:lang w:val="en-GB"/>
         </w:rPr>
-        <w:t xml:space="preserve"> button which will take the default mapping from the main text file. </w:t>
-      </w:r>
-      <w:proofErr w:type="gramStart"/>
-      <w:r>
-        <w:rPr>
-          <w:lang w:val="en-GB"/>
-        </w:rPr>
-        <w:t>Its</w:t>
-      </w:r>
-      <w:proofErr w:type="gramEnd"/>
-      <w:r>
-        <w:rPr>
-          <w:lang w:val="en-GB"/>
-        </w:rPr>
-        <w:t xml:space="preserve"> probably good to press this button anyway as it instantly adds a load of fields you can edit. </w:t>
+        <w:t xml:space="preserve"> button which will take the default mapping from the main text file. Its probably good to press this button anyway as it instantly adds a load of fields you can edit. </w:t>
       </w:r>
     </w:p>
     <w:p>
@@ -1829,35 +1699,7 @@
         <w:rPr>
           <w:lang w:val="en-GB"/>
         </w:rPr>
-        <w:t xml:space="preserve">You can add </w:t>
-      </w:r>
-      <w:proofErr w:type="gramStart"/>
-      <w:r>
-        <w:rPr>
-          <w:lang w:val="en-GB"/>
-        </w:rPr>
-        <w:t>a number of</w:t>
-      </w:r>
-      <w:proofErr w:type="gramEnd"/>
-      <w:r>
-        <w:rPr>
-          <w:lang w:val="en-GB"/>
-        </w:rPr>
-        <w:t xml:space="preserve"> static fields in this tab, these are </w:t>
-      </w:r>
-      <w:proofErr w:type="gramStart"/>
-      <w:r>
-        <w:rPr>
-          <w:lang w:val="en-GB"/>
-        </w:rPr>
-        <w:t>fairly redundant</w:t>
-      </w:r>
-      <w:proofErr w:type="gramEnd"/>
-      <w:r>
-        <w:rPr>
-          <w:lang w:val="en-GB"/>
-        </w:rPr>
-        <w:t xml:space="preserve"> but can be used if you have a static field you want to log such as project manager etc </w:t>
+        <w:t xml:space="preserve">You can add a number of static fields in this tab, these are fairly redundant but can be used if you have a static field you want to log such as project manager etc </w:t>
       </w:r>
     </w:p>
     <w:p>
@@ -1926,35 +1768,7 @@
         <w:rPr>
           <w:lang w:val="en-GB"/>
         </w:rPr>
-        <w:t xml:space="preserve"> is used as a way of looking to make sure that you are logging into the selected directory. If you set it to 15 </w:t>
-      </w:r>
-      <w:proofErr w:type="gramStart"/>
-      <w:r>
-        <w:rPr>
-          <w:lang w:val="en-GB"/>
-        </w:rPr>
-        <w:t>seconds</w:t>
-      </w:r>
-      <w:proofErr w:type="gramEnd"/>
-      <w:r>
-        <w:rPr>
-          <w:lang w:val="en-GB"/>
-        </w:rPr>
-        <w:t xml:space="preserve"> then it will only pull the file name if its </w:t>
-      </w:r>
-      <w:proofErr w:type="spellStart"/>
-      <w:r>
-        <w:rPr>
-          <w:lang w:val="en-GB"/>
-        </w:rPr>
-        <w:t>acitivly</w:t>
-      </w:r>
-      <w:proofErr w:type="spellEnd"/>
-      <w:r>
-        <w:rPr>
-          <w:lang w:val="en-GB"/>
-        </w:rPr>
-        <w:t xml:space="preserve"> logging in the last 15 seconds. If </w:t>
+        <w:t xml:space="preserve"> is used as a way of looking to make sure that you are logging into the selected directory. If you set it to 15 seconds then it will only pull the file name if its acitivly logging in the last 15 seconds. If </w:t>
       </w:r>
       <w:r>
         <w:rPr>
@@ -1966,49 +1780,7 @@
         <w:rPr>
           <w:lang w:val="en-GB"/>
         </w:rPr>
-        <w:t xml:space="preserve">are testing that it works before actually logging </w:t>
-      </w:r>
-      <w:proofErr w:type="gramStart"/>
-      <w:r>
-        <w:rPr>
-          <w:lang w:val="en-GB"/>
-        </w:rPr>
-        <w:t>data</w:t>
-      </w:r>
-      <w:proofErr w:type="gramEnd"/>
-      <w:r>
-        <w:rPr>
-          <w:lang w:val="en-GB"/>
-        </w:rPr>
-        <w:t xml:space="preserve"> then you should set this value to a very high number or else the cell will fill with NA because it </w:t>
-      </w:r>
-      <w:proofErr w:type="gramStart"/>
-      <w:r>
-        <w:rPr>
-          <w:lang w:val="en-GB"/>
-        </w:rPr>
-        <w:t>cant</w:t>
-      </w:r>
-      <w:proofErr w:type="gramEnd"/>
-      <w:r>
-        <w:rPr>
-          <w:lang w:val="en-GB"/>
-        </w:rPr>
-        <w:t xml:space="preserve"> find a file in the set time frame. </w:t>
-      </w:r>
-      <w:proofErr w:type="gramStart"/>
-      <w:r>
-        <w:rPr>
-          <w:lang w:val="en-GB"/>
-        </w:rPr>
-        <w:t>Basically</w:t>
-      </w:r>
-      <w:proofErr w:type="gramEnd"/>
-      <w:r>
-        <w:rPr>
-          <w:lang w:val="en-GB"/>
-        </w:rPr>
-        <w:t xml:space="preserve"> it considers the logging as inactive. </w:t>
+        <w:t xml:space="preserve">are testing that it works before actually logging data then you should set this value to a very high number or else the cell will fill with NA because it cant find a file in the set time frame. Basically it considers the logging as inactive. </w:t>
       </w:r>
     </w:p>
     <w:p>
@@ -2033,21 +1805,7 @@
         <w:rPr>
           <w:lang w:val="en-GB"/>
         </w:rPr>
-        <w:t xml:space="preserve"> works as a QC to ensure you are logging but also stop the log being filled with a file </w:t>
-      </w:r>
-      <w:proofErr w:type="gramStart"/>
-      <w:r>
-        <w:rPr>
-          <w:lang w:val="en-GB"/>
-        </w:rPr>
-        <w:t>name  when</w:t>
-      </w:r>
-      <w:proofErr w:type="gramEnd"/>
-      <w:r>
-        <w:rPr>
-          <w:lang w:val="en-GB"/>
-        </w:rPr>
-        <w:t xml:space="preserve"> you are not actually logging that file for the current task. </w:t>
+        <w:t xml:space="preserve"> works as a QC to ensure you are logging but also stop the log being filled with a file name  when you are not actually logging that file for the current task. </w:t>
       </w:r>
       <w:r>
         <w:rPr>
@@ -2229,16 +1987,8 @@
         <w:rPr>
           <w:lang w:val="en-GB"/>
         </w:rPr>
-        <w:t xml:space="preserve"> This ensures that the log only pulls the file type you are interested in, such </w:t>
-      </w:r>
-      <w:proofErr w:type="spellStart"/>
-      <w:r>
-        <w:rPr>
-          <w:lang w:val="en-GB"/>
-        </w:rPr>
-        <w:t>as.npd</w:t>
-      </w:r>
-      <w:proofErr w:type="spellEnd"/>
+        <w:t xml:space="preserve"> This ensures that the log only pulls the file type you are interested in, such as.npd</w:t>
+      </w:r>
     </w:p>
     <w:p>
       <w:pPr>
@@ -2256,18 +2006,8 @@
           <w:bCs/>
           <w:lang w:val="en-GB"/>
         </w:rPr>
-        <w:t>Log 'X</w:t>
-      </w:r>
-      <w:proofErr w:type="gramStart"/>
-      <w:r>
-        <w:rPr>
-          <w:b/>
-          <w:bCs/>
-          <w:lang w:val="en-GB"/>
-        </w:rPr>
-        <w:t>'?:</w:t>
-      </w:r>
-      <w:proofErr w:type="gramEnd"/>
+        <w:t>Log 'X'?:</w:t>
+      </w:r>
       <w:r>
         <w:rPr>
           <w:lang w:val="en-GB"/>
@@ -2311,43 +2051,7 @@
         <w:rPr>
           <w:lang w:val="en-GB"/>
         </w:rPr>
-        <w:t xml:space="preserve"> This logs the file extension – for the SBD files the name can make excel think the format should be in scientific format so it doesn’t display correctly. Having </w:t>
-      </w:r>
-      <w:proofErr w:type="gramStart"/>
-      <w:r>
-        <w:rPr>
-          <w:lang w:val="en-GB"/>
-        </w:rPr>
-        <w:t>the .</w:t>
-      </w:r>
-      <w:proofErr w:type="spellStart"/>
-      <w:r>
-        <w:rPr>
-          <w:lang w:val="en-GB"/>
-        </w:rPr>
-        <w:t>sbd</w:t>
-      </w:r>
-      <w:proofErr w:type="spellEnd"/>
-      <w:proofErr w:type="gramEnd"/>
-      <w:r>
-        <w:rPr>
-          <w:lang w:val="en-GB"/>
-        </w:rPr>
-        <w:t xml:space="preserve"> at the end negates this. But you can do this to any monitored folder to make sure that </w:t>
-      </w:r>
-      <w:proofErr w:type="gramStart"/>
-      <w:r>
-        <w:rPr>
-          <w:lang w:val="en-GB"/>
-        </w:rPr>
-        <w:t>its</w:t>
-      </w:r>
-      <w:proofErr w:type="gramEnd"/>
-      <w:r>
-        <w:rPr>
-          <w:lang w:val="en-GB"/>
-        </w:rPr>
-        <w:t xml:space="preserve"> getting the correct file </w:t>
+        <w:t xml:space="preserve"> This logs the file extension – for the SBD files the name can make excel think the format should be in scientific format so it doesn’t display correctly. Having the .sbd at the end negates this. But you can do this to any monitored folder to make sure that its getting the correct file </w:t>
       </w:r>
     </w:p>
     <w:p>
@@ -2360,7 +2064,6 @@
           <w:lang w:val="en-GB"/>
         </w:rPr>
       </w:pPr>
-      <w:proofErr w:type="gramStart"/>
       <w:r>
         <w:rPr>
           <w:b/>
@@ -2369,7 +2072,6 @@
         </w:rPr>
         <w:t>Skip?:</w:t>
       </w:r>
-      <w:proofErr w:type="gramEnd"/>
       <w:r>
         <w:rPr>
           <w:lang w:val="en-GB"/>
@@ -2422,21 +2124,7 @@
         <w:rPr>
           <w:lang w:val="en-GB"/>
         </w:rPr>
-        <w:t xml:space="preserve"> Each button can be edited by right clicking it in the GUI, but you can get </w:t>
-      </w:r>
-      <w:proofErr w:type="gramStart"/>
-      <w:r>
-        <w:rPr>
-          <w:lang w:val="en-GB"/>
-        </w:rPr>
-        <w:t>a</w:t>
-      </w:r>
-      <w:proofErr w:type="gramEnd"/>
-      <w:r>
-        <w:rPr>
-          <w:lang w:val="en-GB"/>
-        </w:rPr>
-        <w:t xml:space="preserve"> overview here of all buttons to make changes</w:t>
+        <w:t xml:space="preserve"> Each button can be edited by right clicking it in the GUI, but you can get a overview here of all buttons to make changes</w:t>
       </w:r>
     </w:p>
     <w:p>
@@ -2722,21 +2410,7 @@
         <w:rPr>
           <w:lang w:val="en-GB"/>
         </w:rPr>
-        <w:t xml:space="preserve"> – this directory creates its own settings file of event codes so you can use </w:t>
-      </w:r>
-      <w:proofErr w:type="gramStart"/>
-      <w:r>
-        <w:rPr>
-          <w:lang w:val="en-GB"/>
-        </w:rPr>
-        <w:t>a</w:t>
-      </w:r>
-      <w:proofErr w:type="gramEnd"/>
-      <w:r>
-        <w:rPr>
-          <w:lang w:val="en-GB"/>
-        </w:rPr>
-        <w:t xml:space="preserve"> old setting file for this rather than having to input new codes each time. </w:t>
+        <w:t xml:space="preserve"> – this directory creates its own settings file of event codes so you can use a old setting file for this rather than having to input new codes each time. </w:t>
       </w:r>
     </w:p>
     <w:p>
@@ -2759,19 +2433,11 @@
           <w:lang w:val="en-GB"/>
         </w:rPr>
       </w:pPr>
-      <w:proofErr w:type="gramStart"/>
-      <w:r>
-        <w:rPr>
-          <w:lang w:val="en-GB"/>
-        </w:rPr>
-        <w:t>Starting Monitoring</w:t>
-      </w:r>
-      <w:proofErr w:type="gramEnd"/>
-      <w:r>
-        <w:rPr>
-          <w:lang w:val="en-GB"/>
-        </w:rPr>
-        <w:t xml:space="preserve"> and Logging</w:t>
+      <w:r>
+        <w:rPr>
+          <w:lang w:val="en-GB"/>
+        </w:rPr>
+        <w:t>Starting Monitoring and Logging</w:t>
       </w:r>
     </w:p>
     <w:p>
@@ -2829,35 +2495,7 @@
         <w:rPr>
           <w:lang w:val="en-GB"/>
         </w:rPr>
-        <w:t xml:space="preserve"> This function scans all the folders you have selected to monitor and then holds the latest 5 files it finds in a cache – </w:t>
-      </w:r>
-      <w:proofErr w:type="gramStart"/>
-      <w:r>
-        <w:rPr>
-          <w:lang w:val="en-GB"/>
-        </w:rPr>
-        <w:t>this speeds</w:t>
-      </w:r>
-      <w:proofErr w:type="gramEnd"/>
-      <w:r>
-        <w:rPr>
-          <w:lang w:val="en-GB"/>
-        </w:rPr>
-        <w:t xml:space="preserve"> up the process of logging data because it only needs to look at 5 files rather than all the files in the folder. The initial start monitoring may take a while if you have lots of folder to </w:t>
-      </w:r>
-      <w:proofErr w:type="gramStart"/>
-      <w:r>
-        <w:rPr>
-          <w:lang w:val="en-GB"/>
-        </w:rPr>
-        <w:t>look into</w:t>
-      </w:r>
-      <w:proofErr w:type="gramEnd"/>
-      <w:r>
-        <w:rPr>
-          <w:lang w:val="en-GB"/>
-        </w:rPr>
-        <w:t xml:space="preserve"> selected. </w:t>
+        <w:t xml:space="preserve"> This function scans all the folders you have selected to monitor and then holds the latest 5 files it finds in a cache – this speeds up the process of logging data because it only needs to look at 5 files rather than all the files in the folder. The initial start monitoring may take a while if you have lots of folder to look into selected. </w:t>
       </w:r>
     </w:p>
     <w:p>
@@ -2982,49 +2620,7 @@
         <w:rPr>
           <w:lang w:val="en-GB"/>
         </w:rPr>
-        <w:t xml:space="preserve">Hourly KP log – </w:t>
-      </w:r>
-      <w:proofErr w:type="gramStart"/>
-      <w:r>
-        <w:rPr>
-          <w:lang w:val="en-GB"/>
-        </w:rPr>
-        <w:t>This needs</w:t>
-      </w:r>
-      <w:proofErr w:type="gramEnd"/>
-      <w:r>
-        <w:rPr>
-          <w:lang w:val="en-GB"/>
-        </w:rPr>
-        <w:t xml:space="preserve"> further testing but it should consider the line name and accumulate the KP distance covered between the last KP </w:t>
-      </w:r>
-      <w:proofErr w:type="gramStart"/>
-      <w:r>
-        <w:rPr>
-          <w:lang w:val="en-GB"/>
-        </w:rPr>
-        <w:t>event</w:t>
-      </w:r>
-      <w:proofErr w:type="gramEnd"/>
-      <w:r>
-        <w:rPr>
-          <w:lang w:val="en-GB"/>
-        </w:rPr>
-        <w:t xml:space="preserve"> which is 1 hour, unless you manually press the manual KP log on the main </w:t>
-      </w:r>
-      <w:proofErr w:type="spellStart"/>
-      <w:r>
-        <w:rPr>
-          <w:lang w:val="en-GB"/>
-        </w:rPr>
-        <w:t>gui</w:t>
-      </w:r>
-      <w:proofErr w:type="spellEnd"/>
-      <w:r>
-        <w:rPr>
-          <w:lang w:val="en-GB"/>
-        </w:rPr>
-        <w:t xml:space="preserve">. </w:t>
+        <w:t xml:space="preserve">Hourly KP log – This needs further testing but it should consider the line name and accumulate the KP distance covered between the last KP event which is 1 hour, unless you manually press the manual KP log on the main gui. </w:t>
       </w:r>
       <w:r>
         <w:rPr>
@@ -3054,35 +2650,7 @@
         <w:rPr>
           <w:lang w:val="en-GB"/>
         </w:rPr>
-        <w:t xml:space="preserve"> If there isn’t a KP associated with log on and log </w:t>
-      </w:r>
-      <w:proofErr w:type="gramStart"/>
-      <w:r>
-        <w:rPr>
-          <w:lang w:val="en-GB"/>
-        </w:rPr>
-        <w:t>off</w:t>
-      </w:r>
-      <w:proofErr w:type="gramEnd"/>
-      <w:r>
-        <w:rPr>
-          <w:lang w:val="en-GB"/>
-        </w:rPr>
-        <w:t xml:space="preserve"> then the function won’t be </w:t>
-      </w:r>
-      <w:proofErr w:type="gramStart"/>
-      <w:r>
-        <w:rPr>
-          <w:lang w:val="en-GB"/>
-        </w:rPr>
-        <w:t>called</w:t>
-      </w:r>
-      <w:proofErr w:type="gramEnd"/>
-      <w:r>
-        <w:rPr>
-          <w:lang w:val="en-GB"/>
-        </w:rPr>
-        <w:t xml:space="preserve"> and it will just say Log off </w:t>
+        <w:t xml:space="preserve"> If there isn’t a KP associated with log on and log off then the function won’t be called and it will just say Log off </w:t>
       </w:r>
     </w:p>
     <w:p>
@@ -3149,23 +2717,299 @@
         <w:rPr>
           <w:lang w:val="en-GB"/>
         </w:rPr>
-        <w:t xml:space="preserve">The database Sync is only valid if you are using the program to log to an SQL. In here you set the automatic sync interval which will mirror any changes you make to the excel log to the SQL. Since the SQL is logged instantly on a button press, this doesn’t always mirror what you may change the event text to for example. This function ensures that changes are pushed though at a defined </w:t>
-      </w:r>
-      <w:proofErr w:type="gramStart"/>
-      <w:r>
-        <w:rPr>
-          <w:lang w:val="en-GB"/>
-        </w:rPr>
-        <w:t>interval</w:t>
-      </w:r>
-      <w:proofErr w:type="gramEnd"/>
-      <w:r>
-        <w:rPr>
-          <w:lang w:val="en-GB"/>
-        </w:rPr>
-        <w:t xml:space="preserve"> and the field log viewers are kept up to date</w:t>
-      </w:r>
-    </w:p>
+        <w:t>The database Sync is only valid if you are using the program to log to an SQL. In here you set the automatic sync interval which will mirror any changes you make to the excel log to the SQL. Since the SQL is logged instantly on a button press, this doesn’t always mirror what you may change the event text to for example. This function ensures that changes are pushed though at a defined interval and the field log viewers are kept up to date</w:t>
+      </w:r>
+    </w:p>
+    <w:p>
+      <w:pPr>
+        <w:pStyle w:val="Heading1"/>
+      </w:pPr>
+      <w:r>
+        <w:t xml:space="preserve"> </w:t>
+      </w:r>
+      <w:r>
+        <w:t>Project Settings</w:t>
+      </w:r>
+    </w:p>
+    <w:p>
+      <w:r>
+        <w:t>Use Projects to save and reuse all configuration for a job or vessel. A project file (.json) holds your monitored folders, mappings, button layouts/colors, programmatic events, and event codes in one place.</w:t>
+      </w:r>
+    </w:p>
+    <w:p>
+      <w:r>
+        <w:t>Where to find it</w:t>
+      </w:r>
+      <w:r>
+        <w:t>:</w:t>
+      </w:r>
+    </w:p>
+    <w:p>
+      <w:pPr>
+        <w:pStyle w:val="ListParagraph"/>
+        <w:numPr>
+          <w:ilvl w:val="0"/>
+          <w:numId w:val="16"/>
+        </w:numPr>
+      </w:pPr>
+      <w:r>
+        <w:t>Open Settings → Projects.</w:t>
+      </w:r>
+    </w:p>
+    <w:p>
+      <w:pPr>
+        <w:pStyle w:val="ListParagraph"/>
+        <w:numPr>
+          <w:ilvl w:val="0"/>
+          <w:numId w:val="16"/>
+        </w:numPr>
+      </w:pPr>
+      <w:r>
+        <w:t>The Current Project section shows the active project path (read</w:t>
+      </w:r>
+      <w:r>
+        <w:noBreakHyphen/>
+        <w:t>only).</w:t>
+      </w:r>
+    </w:p>
+    <w:p>
+      <w:r>
+        <w:t>Controls</w:t>
+      </w:r>
+    </w:p>
+    <w:p>
+      <w:pPr>
+        <w:pStyle w:val="ListParagraph"/>
+        <w:numPr>
+          <w:ilvl w:val="0"/>
+          <w:numId w:val="17"/>
+        </w:numPr>
+      </w:pPr>
+      <w:r>
+        <w:rPr>
+          <w:b/>
+          <w:bCs/>
+        </w:rPr>
+        <w:t>Browse…</w:t>
+      </w:r>
+      <w:r>
+        <w:rPr>
+          <w:b/>
+          <w:bCs/>
+        </w:rPr>
+        <w:t xml:space="preserve"> </w:t>
+      </w:r>
+      <w:r>
+        <w:t xml:space="preserve">: </w:t>
+      </w:r>
+      <w:r>
+        <w:t>Select an existing project (.json). The path field updates; nothing is applied until you Load.</w:t>
+      </w:r>
+    </w:p>
+    <w:p>
+      <w:pPr>
+        <w:pStyle w:val="ListParagraph"/>
+        <w:numPr>
+          <w:ilvl w:val="0"/>
+          <w:numId w:val="17"/>
+        </w:numPr>
+      </w:pPr>
+      <w:r>
+        <w:rPr>
+          <w:b/>
+          <w:bCs/>
+        </w:rPr>
+        <w:t>Load Project</w:t>
+      </w:r>
+      <w:r>
+        <w:rPr>
+          <w:b/>
+          <w:bCs/>
+        </w:rPr>
+        <w:t>:</w:t>
+      </w:r>
+      <w:r>
+        <w:t xml:space="preserve"> </w:t>
+      </w:r>
+      <w:r>
+        <w:t>Loads the selected file and makes it the active project. The app remembers the last loaded project for next start.</w:t>
+      </w:r>
+    </w:p>
+    <w:p>
+      <w:pPr>
+        <w:pStyle w:val="ListParagraph"/>
+        <w:numPr>
+          <w:ilvl w:val="0"/>
+          <w:numId w:val="17"/>
+        </w:numPr>
+      </w:pPr>
+      <w:r>
+        <w:rPr>
+          <w:b/>
+          <w:bCs/>
+        </w:rPr>
+        <w:t>Save Project</w:t>
+      </w:r>
+      <w:r>
+        <w:rPr>
+          <w:b/>
+          <w:bCs/>
+        </w:rPr>
+        <w:t>:</w:t>
+      </w:r>
+      <w:r>
+        <w:t xml:space="preserve"> </w:t>
+      </w:r>
+      <w:r>
+        <w:t>Saves all current settings to the active project path. If no project is active, you’ll be prompted to use Save As.</w:t>
+      </w:r>
+    </w:p>
+    <w:p>
+      <w:pPr>
+        <w:pStyle w:val="ListParagraph"/>
+        <w:numPr>
+          <w:ilvl w:val="0"/>
+          <w:numId w:val="17"/>
+        </w:numPr>
+      </w:pPr>
+      <w:r>
+        <w:rPr>
+          <w:b/>
+          <w:bCs/>
+        </w:rPr>
+        <w:t>Save As…</w:t>
+      </w:r>
+      <w:r>
+        <w:rPr>
+          <w:b/>
+          <w:bCs/>
+        </w:rPr>
+        <w:t>:</w:t>
+      </w:r>
+      <w:r>
+        <w:t xml:space="preserve"> </w:t>
+      </w:r>
+      <w:r>
+        <w:t>Creates a new project file (.json) and makes it the active one. Use this to branch settings per client/job.</w:t>
+      </w:r>
+    </w:p>
+    <w:p>
+      <w:pPr>
+        <w:pStyle w:val="ListParagraph"/>
+        <w:numPr>
+          <w:ilvl w:val="0"/>
+          <w:numId w:val="17"/>
+        </w:numPr>
+      </w:pPr>
+      <w:r>
+        <w:rPr>
+          <w:b/>
+          <w:bCs/>
+        </w:rPr>
+        <w:t>Restore Blank Project (red)</w:t>
+      </w:r>
+      <w:r>
+        <w:rPr>
+          <w:b/>
+          <w:bCs/>
+        </w:rPr>
+        <w:t>:</w:t>
+      </w:r>
+      <w:r>
+        <w:t xml:space="preserve"> </w:t>
+      </w:r>
+      <w:r>
+        <w:t>Loads a clean template into memory (no files are overwritten). The active project path is cleared; use Save As to persist.</w:t>
+      </w:r>
+    </w:p>
+    <w:p>
+      <w:r>
+        <w:t>How it behaves</w:t>
+      </w:r>
+    </w:p>
+    <w:p>
+      <w:pPr>
+        <w:pStyle w:val="ListParagraph"/>
+        <w:numPr>
+          <w:ilvl w:val="0"/>
+          <w:numId w:val="18"/>
+        </w:numPr>
+      </w:pPr>
+      <w:r>
+        <w:t>One project file contains everything, including event codes (no separate codes file needed).</w:t>
+      </w:r>
+    </w:p>
+    <w:p>
+      <w:pPr>
+        <w:pStyle w:val="ListParagraph"/>
+        <w:numPr>
+          <w:ilvl w:val="0"/>
+          <w:numId w:val="18"/>
+        </w:numPr>
+      </w:pPr>
+      <w:r>
+        <w:t>The last loaded project is remembered automatically and reloaded on the next launch.</w:t>
+      </w:r>
+    </w:p>
+    <w:p>
+      <w:pPr>
+        <w:pStyle w:val="ListParagraph"/>
+        <w:numPr>
+          <w:ilvl w:val="0"/>
+          <w:numId w:val="18"/>
+        </w:numPr>
+      </w:pPr>
+      <w:r>
+        <w:lastRenderedPageBreak/>
+        <w:t>After restoring the blank project, the structure viewer shows default values; use Save As to store it.</w:t>
+      </w:r>
+    </w:p>
+    <w:p>
+      <w:pPr>
+        <w:pStyle w:val="ListParagraph"/>
+        <w:numPr>
+          <w:ilvl w:val="0"/>
+          <w:numId w:val="18"/>
+        </w:numPr>
+      </w:pPr>
+      <w:r>
+        <w:t xml:space="preserve"> Changes made anywhere in Settings only persist to disk when you Save (or Save As) the project.</w:t>
+      </w:r>
+    </w:p>
+    <w:p>
+      <w:r>
+        <w:t>Tips</w:t>
+      </w:r>
+    </w:p>
+    <w:p>
+      <w:pPr>
+        <w:pStyle w:val="ListParagraph"/>
+        <w:numPr>
+          <w:ilvl w:val="0"/>
+          <w:numId w:val="19"/>
+        </w:numPr>
+      </w:pPr>
+      <w:r>
+        <w:t>Keep a separate project per scope (e.g., vessel, field, or client/job) to avoid accidental cross</w:t>
+      </w:r>
+      <w:r>
+        <w:noBreakHyphen/>
+        <w:t>use.</w:t>
+      </w:r>
+    </w:p>
+    <w:p>
+      <w:pPr>
+        <w:pStyle w:val="ListParagraph"/>
+        <w:numPr>
+          <w:ilvl w:val="0"/>
+          <w:numId w:val="19"/>
+        </w:numPr>
+      </w:pPr>
+      <w:r>
+        <w:t>Store projects under the app’s settings folder for easy backup, or version them in source control if desired.</w:t>
+      </w:r>
+    </w:p>
+    <w:p/>
     <w:p>
       <w:pPr>
         <w:pStyle w:val="Heading1"/>
@@ -3216,21 +3060,7 @@
         <w:rPr>
           <w:lang w:val="en-GB"/>
         </w:rPr>
-        <w:t xml:space="preserve"> Use these to record the start and end of a logging session. "Log off" will automatically calculate distance </w:t>
-      </w:r>
-      <w:proofErr w:type="spellStart"/>
-      <w:r>
-        <w:rPr>
-          <w:lang w:val="en-GB"/>
-        </w:rPr>
-        <w:t>traveled</w:t>
-      </w:r>
-      <w:proofErr w:type="spellEnd"/>
-      <w:r>
-        <w:rPr>
-          <w:lang w:val="en-GB"/>
-        </w:rPr>
-        <w:t xml:space="preserve"> and speed if enabled in settings.</w:t>
+        <w:t xml:space="preserve"> Use these to record the start and end of a logging session. "Log off" will automatically calculate distance traveled and speed if enabled in settings.</w:t>
       </w:r>
     </w:p>
     <w:p>
@@ -3345,21 +3175,7 @@
         <w:rPr>
           <w:lang w:val="en-GB"/>
         </w:rPr>
-        <w:t xml:space="preserve">You can quickly change a button's text, event description, source, or </w:t>
-      </w:r>
-      <w:proofErr w:type="spellStart"/>
-      <w:r>
-        <w:rPr>
-          <w:lang w:val="en-GB"/>
-        </w:rPr>
-        <w:t>color</w:t>
-      </w:r>
-      <w:proofErr w:type="spellEnd"/>
-      <w:r>
-        <w:rPr>
-          <w:lang w:val="en-GB"/>
-        </w:rPr>
-        <w:t xml:space="preserve"> without opening the main Settings window.</w:t>
+        <w:t>You can quickly change a button's text, event description, source, or color without opening the main Settings window.</w:t>
       </w:r>
     </w:p>
     <w:p>
@@ -3653,6 +3469,119 @@
     </w:lvl>
   </w:abstractNum>
   <w:abstractNum w:abstractNumId="1" w15:restartNumberingAfterBreak="0">
+    <w:nsid w:val="07322E05"/>
+    <w:multiLevelType w:val="hybridMultilevel"/>
+    <w:tmpl w:val="6A026D72"/>
+    <w:lvl w:ilvl="0" w:tplc="04090001">
+      <w:start w:val="1"/>
+      <w:numFmt w:val="bullet"/>
+      <w:lvlText w:val=""/>
+      <w:lvlJc w:val="left"/>
+      <w:pPr>
+        <w:ind w:left="720" w:hanging="360"/>
+      </w:pPr>
+      <w:rPr>
+        <w:rFonts w:ascii="Symbol" w:hAnsi="Symbol" w:hint="default"/>
+      </w:rPr>
+    </w:lvl>
+    <w:lvl w:ilvl="1" w:tplc="04090003" w:tentative="1">
+      <w:start w:val="1"/>
+      <w:numFmt w:val="bullet"/>
+      <w:lvlText w:val="o"/>
+      <w:lvlJc w:val="left"/>
+      <w:pPr>
+        <w:ind w:left="1440" w:hanging="360"/>
+      </w:pPr>
+      <w:rPr>
+        <w:rFonts w:ascii="Courier New" w:hAnsi="Courier New" w:cs="Courier New" w:hint="default"/>
+      </w:rPr>
+    </w:lvl>
+    <w:lvl w:ilvl="2" w:tplc="04090005" w:tentative="1">
+      <w:start w:val="1"/>
+      <w:numFmt w:val="bullet"/>
+      <w:lvlText w:val=""/>
+      <w:lvlJc w:val="left"/>
+      <w:pPr>
+        <w:ind w:left="2160" w:hanging="360"/>
+      </w:pPr>
+      <w:rPr>
+        <w:rFonts w:ascii="Wingdings" w:hAnsi="Wingdings" w:hint="default"/>
+      </w:rPr>
+    </w:lvl>
+    <w:lvl w:ilvl="3" w:tplc="04090001" w:tentative="1">
+      <w:start w:val="1"/>
+      <w:numFmt w:val="bullet"/>
+      <w:lvlText w:val=""/>
+      <w:lvlJc w:val="left"/>
+      <w:pPr>
+        <w:ind w:left="2880" w:hanging="360"/>
+      </w:pPr>
+      <w:rPr>
+        <w:rFonts w:ascii="Symbol" w:hAnsi="Symbol" w:hint="default"/>
+      </w:rPr>
+    </w:lvl>
+    <w:lvl w:ilvl="4" w:tplc="04090003" w:tentative="1">
+      <w:start w:val="1"/>
+      <w:numFmt w:val="bullet"/>
+      <w:lvlText w:val="o"/>
+      <w:lvlJc w:val="left"/>
+      <w:pPr>
+        <w:ind w:left="3600" w:hanging="360"/>
+      </w:pPr>
+      <w:rPr>
+        <w:rFonts w:ascii="Courier New" w:hAnsi="Courier New" w:cs="Courier New" w:hint="default"/>
+      </w:rPr>
+    </w:lvl>
+    <w:lvl w:ilvl="5" w:tplc="04090005" w:tentative="1">
+      <w:start w:val="1"/>
+      <w:numFmt w:val="bullet"/>
+      <w:lvlText w:val=""/>
+      <w:lvlJc w:val="left"/>
+      <w:pPr>
+        <w:ind w:left="4320" w:hanging="360"/>
+      </w:pPr>
+      <w:rPr>
+        <w:rFonts w:ascii="Wingdings" w:hAnsi="Wingdings" w:hint="default"/>
+      </w:rPr>
+    </w:lvl>
+    <w:lvl w:ilvl="6" w:tplc="04090001" w:tentative="1">
+      <w:start w:val="1"/>
+      <w:numFmt w:val="bullet"/>
+      <w:lvlText w:val=""/>
+      <w:lvlJc w:val="left"/>
+      <w:pPr>
+        <w:ind w:left="5040" w:hanging="360"/>
+      </w:pPr>
+      <w:rPr>
+        <w:rFonts w:ascii="Symbol" w:hAnsi="Symbol" w:hint="default"/>
+      </w:rPr>
+    </w:lvl>
+    <w:lvl w:ilvl="7" w:tplc="04090003" w:tentative="1">
+      <w:start w:val="1"/>
+      <w:numFmt w:val="bullet"/>
+      <w:lvlText w:val="o"/>
+      <w:lvlJc w:val="left"/>
+      <w:pPr>
+        <w:ind w:left="5760" w:hanging="360"/>
+      </w:pPr>
+      <w:rPr>
+        <w:rFonts w:ascii="Courier New" w:hAnsi="Courier New" w:cs="Courier New" w:hint="default"/>
+      </w:rPr>
+    </w:lvl>
+    <w:lvl w:ilvl="8" w:tplc="04090005" w:tentative="1">
+      <w:start w:val="1"/>
+      <w:numFmt w:val="bullet"/>
+      <w:lvlText w:val=""/>
+      <w:lvlJc w:val="left"/>
+      <w:pPr>
+        <w:ind w:left="6480" w:hanging="360"/>
+      </w:pPr>
+      <w:rPr>
+        <w:rFonts w:ascii="Wingdings" w:hAnsi="Wingdings" w:hint="default"/>
+      </w:rPr>
+    </w:lvl>
+  </w:abstractNum>
+  <w:abstractNum w:abstractNumId="2" w15:restartNumberingAfterBreak="0">
     <w:nsid w:val="163D5348"/>
     <w:multiLevelType w:val="multilevel"/>
     <w:tmpl w:val="84985F14"/>
@@ -3769,7 +3698,7 @@
       </w:pPr>
     </w:lvl>
   </w:abstractNum>
-  <w:abstractNum w:abstractNumId="2" w15:restartNumberingAfterBreak="0">
+  <w:abstractNum w:abstractNumId="3" w15:restartNumberingAfterBreak="0">
     <w:nsid w:val="195100EA"/>
     <w:multiLevelType w:val="multilevel"/>
     <w:tmpl w:val="609CB1C8"/>
@@ -3882,7 +3811,233 @@
       </w:pPr>
     </w:lvl>
   </w:abstractNum>
-  <w:abstractNum w:abstractNumId="3" w15:restartNumberingAfterBreak="0">
+  <w:abstractNum w:abstractNumId="4" w15:restartNumberingAfterBreak="0">
+    <w:nsid w:val="1A8E738A"/>
+    <w:multiLevelType w:val="hybridMultilevel"/>
+    <w:tmpl w:val="6C62728C"/>
+    <w:lvl w:ilvl="0" w:tplc="04090001">
+      <w:start w:val="1"/>
+      <w:numFmt w:val="bullet"/>
+      <w:lvlText w:val=""/>
+      <w:lvlJc w:val="left"/>
+      <w:pPr>
+        <w:ind w:left="720" w:hanging="360"/>
+      </w:pPr>
+      <w:rPr>
+        <w:rFonts w:ascii="Symbol" w:hAnsi="Symbol" w:hint="default"/>
+      </w:rPr>
+    </w:lvl>
+    <w:lvl w:ilvl="1" w:tplc="04090003" w:tentative="1">
+      <w:start w:val="1"/>
+      <w:numFmt w:val="bullet"/>
+      <w:lvlText w:val="o"/>
+      <w:lvlJc w:val="left"/>
+      <w:pPr>
+        <w:ind w:left="1440" w:hanging="360"/>
+      </w:pPr>
+      <w:rPr>
+        <w:rFonts w:ascii="Courier New" w:hAnsi="Courier New" w:cs="Courier New" w:hint="default"/>
+      </w:rPr>
+    </w:lvl>
+    <w:lvl w:ilvl="2" w:tplc="04090005" w:tentative="1">
+      <w:start w:val="1"/>
+      <w:numFmt w:val="bullet"/>
+      <w:lvlText w:val=""/>
+      <w:lvlJc w:val="left"/>
+      <w:pPr>
+        <w:ind w:left="2160" w:hanging="360"/>
+      </w:pPr>
+      <w:rPr>
+        <w:rFonts w:ascii="Wingdings" w:hAnsi="Wingdings" w:hint="default"/>
+      </w:rPr>
+    </w:lvl>
+    <w:lvl w:ilvl="3" w:tplc="04090001" w:tentative="1">
+      <w:start w:val="1"/>
+      <w:numFmt w:val="bullet"/>
+      <w:lvlText w:val=""/>
+      <w:lvlJc w:val="left"/>
+      <w:pPr>
+        <w:ind w:left="2880" w:hanging="360"/>
+      </w:pPr>
+      <w:rPr>
+        <w:rFonts w:ascii="Symbol" w:hAnsi="Symbol" w:hint="default"/>
+      </w:rPr>
+    </w:lvl>
+    <w:lvl w:ilvl="4" w:tplc="04090003" w:tentative="1">
+      <w:start w:val="1"/>
+      <w:numFmt w:val="bullet"/>
+      <w:lvlText w:val="o"/>
+      <w:lvlJc w:val="left"/>
+      <w:pPr>
+        <w:ind w:left="3600" w:hanging="360"/>
+      </w:pPr>
+      <w:rPr>
+        <w:rFonts w:ascii="Courier New" w:hAnsi="Courier New" w:cs="Courier New" w:hint="default"/>
+      </w:rPr>
+    </w:lvl>
+    <w:lvl w:ilvl="5" w:tplc="04090005" w:tentative="1">
+      <w:start w:val="1"/>
+      <w:numFmt w:val="bullet"/>
+      <w:lvlText w:val=""/>
+      <w:lvlJc w:val="left"/>
+      <w:pPr>
+        <w:ind w:left="4320" w:hanging="360"/>
+      </w:pPr>
+      <w:rPr>
+        <w:rFonts w:ascii="Wingdings" w:hAnsi="Wingdings" w:hint="default"/>
+      </w:rPr>
+    </w:lvl>
+    <w:lvl w:ilvl="6" w:tplc="04090001" w:tentative="1">
+      <w:start w:val="1"/>
+      <w:numFmt w:val="bullet"/>
+      <w:lvlText w:val=""/>
+      <w:lvlJc w:val="left"/>
+      <w:pPr>
+        <w:ind w:left="5040" w:hanging="360"/>
+      </w:pPr>
+      <w:rPr>
+        <w:rFonts w:ascii="Symbol" w:hAnsi="Symbol" w:hint="default"/>
+      </w:rPr>
+    </w:lvl>
+    <w:lvl w:ilvl="7" w:tplc="04090003" w:tentative="1">
+      <w:start w:val="1"/>
+      <w:numFmt w:val="bullet"/>
+      <w:lvlText w:val="o"/>
+      <w:lvlJc w:val="left"/>
+      <w:pPr>
+        <w:ind w:left="5760" w:hanging="360"/>
+      </w:pPr>
+      <w:rPr>
+        <w:rFonts w:ascii="Courier New" w:hAnsi="Courier New" w:cs="Courier New" w:hint="default"/>
+      </w:rPr>
+    </w:lvl>
+    <w:lvl w:ilvl="8" w:tplc="04090005" w:tentative="1">
+      <w:start w:val="1"/>
+      <w:numFmt w:val="bullet"/>
+      <w:lvlText w:val=""/>
+      <w:lvlJc w:val="left"/>
+      <w:pPr>
+        <w:ind w:left="6480" w:hanging="360"/>
+      </w:pPr>
+      <w:rPr>
+        <w:rFonts w:ascii="Wingdings" w:hAnsi="Wingdings" w:hint="default"/>
+      </w:rPr>
+    </w:lvl>
+  </w:abstractNum>
+  <w:abstractNum w:abstractNumId="5" w15:restartNumberingAfterBreak="0">
+    <w:nsid w:val="2049404C"/>
+    <w:multiLevelType w:val="hybridMultilevel"/>
+    <w:tmpl w:val="E8581D3E"/>
+    <w:lvl w:ilvl="0" w:tplc="04090001">
+      <w:start w:val="1"/>
+      <w:numFmt w:val="bullet"/>
+      <w:lvlText w:val=""/>
+      <w:lvlJc w:val="left"/>
+      <w:pPr>
+        <w:ind w:left="720" w:hanging="360"/>
+      </w:pPr>
+      <w:rPr>
+        <w:rFonts w:ascii="Symbol" w:hAnsi="Symbol" w:hint="default"/>
+      </w:rPr>
+    </w:lvl>
+    <w:lvl w:ilvl="1" w:tplc="04090003" w:tentative="1">
+      <w:start w:val="1"/>
+      <w:numFmt w:val="bullet"/>
+      <w:lvlText w:val="o"/>
+      <w:lvlJc w:val="left"/>
+      <w:pPr>
+        <w:ind w:left="1440" w:hanging="360"/>
+      </w:pPr>
+      <w:rPr>
+        <w:rFonts w:ascii="Courier New" w:hAnsi="Courier New" w:cs="Courier New" w:hint="default"/>
+      </w:rPr>
+    </w:lvl>
+    <w:lvl w:ilvl="2" w:tplc="04090005" w:tentative="1">
+      <w:start w:val="1"/>
+      <w:numFmt w:val="bullet"/>
+      <w:lvlText w:val=""/>
+      <w:lvlJc w:val="left"/>
+      <w:pPr>
+        <w:ind w:left="2160" w:hanging="360"/>
+      </w:pPr>
+      <w:rPr>
+        <w:rFonts w:ascii="Wingdings" w:hAnsi="Wingdings" w:hint="default"/>
+      </w:rPr>
+    </w:lvl>
+    <w:lvl w:ilvl="3" w:tplc="04090001" w:tentative="1">
+      <w:start w:val="1"/>
+      <w:numFmt w:val="bullet"/>
+      <w:lvlText w:val=""/>
+      <w:lvlJc w:val="left"/>
+      <w:pPr>
+        <w:ind w:left="2880" w:hanging="360"/>
+      </w:pPr>
+      <w:rPr>
+        <w:rFonts w:ascii="Symbol" w:hAnsi="Symbol" w:hint="default"/>
+      </w:rPr>
+    </w:lvl>
+    <w:lvl w:ilvl="4" w:tplc="04090003" w:tentative="1">
+      <w:start w:val="1"/>
+      <w:numFmt w:val="bullet"/>
+      <w:lvlText w:val="o"/>
+      <w:lvlJc w:val="left"/>
+      <w:pPr>
+        <w:ind w:left="3600" w:hanging="360"/>
+      </w:pPr>
+      <w:rPr>
+        <w:rFonts w:ascii="Courier New" w:hAnsi="Courier New" w:cs="Courier New" w:hint="default"/>
+      </w:rPr>
+    </w:lvl>
+    <w:lvl w:ilvl="5" w:tplc="04090005" w:tentative="1">
+      <w:start w:val="1"/>
+      <w:numFmt w:val="bullet"/>
+      <w:lvlText w:val=""/>
+      <w:lvlJc w:val="left"/>
+      <w:pPr>
+        <w:ind w:left="4320" w:hanging="360"/>
+      </w:pPr>
+      <w:rPr>
+        <w:rFonts w:ascii="Wingdings" w:hAnsi="Wingdings" w:hint="default"/>
+      </w:rPr>
+    </w:lvl>
+    <w:lvl w:ilvl="6" w:tplc="04090001" w:tentative="1">
+      <w:start w:val="1"/>
+      <w:numFmt w:val="bullet"/>
+      <w:lvlText w:val=""/>
+      <w:lvlJc w:val="left"/>
+      <w:pPr>
+        <w:ind w:left="5040" w:hanging="360"/>
+      </w:pPr>
+      <w:rPr>
+        <w:rFonts w:ascii="Symbol" w:hAnsi="Symbol" w:hint="default"/>
+      </w:rPr>
+    </w:lvl>
+    <w:lvl w:ilvl="7" w:tplc="04090003" w:tentative="1">
+      <w:start w:val="1"/>
+      <w:numFmt w:val="bullet"/>
+      <w:lvlText w:val="o"/>
+      <w:lvlJc w:val="left"/>
+      <w:pPr>
+        <w:ind w:left="5760" w:hanging="360"/>
+      </w:pPr>
+      <w:rPr>
+        <w:rFonts w:ascii="Courier New" w:hAnsi="Courier New" w:cs="Courier New" w:hint="default"/>
+      </w:rPr>
+    </w:lvl>
+    <w:lvl w:ilvl="8" w:tplc="04090005" w:tentative="1">
+      <w:start w:val="1"/>
+      <w:numFmt w:val="bullet"/>
+      <w:lvlText w:val=""/>
+      <w:lvlJc w:val="left"/>
+      <w:pPr>
+        <w:ind w:left="6480" w:hanging="360"/>
+      </w:pPr>
+      <w:rPr>
+        <w:rFonts w:ascii="Wingdings" w:hAnsi="Wingdings" w:hint="default"/>
+      </w:rPr>
+    </w:lvl>
+  </w:abstractNum>
+  <w:abstractNum w:abstractNumId="6" w15:restartNumberingAfterBreak="0">
     <w:nsid w:val="4486025D"/>
     <w:multiLevelType w:val="multilevel"/>
     <w:tmpl w:val="A89AB4C2"/>
@@ -3999,7 +4154,7 @@
       </w:pPr>
     </w:lvl>
   </w:abstractNum>
-  <w:abstractNum w:abstractNumId="4" w15:restartNumberingAfterBreak="0">
+  <w:abstractNum w:abstractNumId="7" w15:restartNumberingAfterBreak="0">
     <w:nsid w:val="4D9A5913"/>
     <w:multiLevelType w:val="multilevel"/>
     <w:tmpl w:val="EC9E1F64"/>
@@ -4116,7 +4271,120 @@
       </w:pPr>
     </w:lvl>
   </w:abstractNum>
-  <w:abstractNum w:abstractNumId="5" w15:restartNumberingAfterBreak="0">
+  <w:abstractNum w:abstractNumId="8" w15:restartNumberingAfterBreak="0">
+    <w:nsid w:val="4F7A4399"/>
+    <w:multiLevelType w:val="hybridMultilevel"/>
+    <w:tmpl w:val="19CE5078"/>
+    <w:lvl w:ilvl="0" w:tplc="04090001">
+      <w:start w:val="1"/>
+      <w:numFmt w:val="bullet"/>
+      <w:lvlText w:val=""/>
+      <w:lvlJc w:val="left"/>
+      <w:pPr>
+        <w:ind w:left="720" w:hanging="360"/>
+      </w:pPr>
+      <w:rPr>
+        <w:rFonts w:ascii="Symbol" w:hAnsi="Symbol" w:hint="default"/>
+      </w:rPr>
+    </w:lvl>
+    <w:lvl w:ilvl="1" w:tplc="04090003" w:tentative="1">
+      <w:start w:val="1"/>
+      <w:numFmt w:val="bullet"/>
+      <w:lvlText w:val="o"/>
+      <w:lvlJc w:val="left"/>
+      <w:pPr>
+        <w:ind w:left="1440" w:hanging="360"/>
+      </w:pPr>
+      <w:rPr>
+        <w:rFonts w:ascii="Courier New" w:hAnsi="Courier New" w:cs="Courier New" w:hint="default"/>
+      </w:rPr>
+    </w:lvl>
+    <w:lvl w:ilvl="2" w:tplc="04090005" w:tentative="1">
+      <w:start w:val="1"/>
+      <w:numFmt w:val="bullet"/>
+      <w:lvlText w:val=""/>
+      <w:lvlJc w:val="left"/>
+      <w:pPr>
+        <w:ind w:left="2160" w:hanging="360"/>
+      </w:pPr>
+      <w:rPr>
+        <w:rFonts w:ascii="Wingdings" w:hAnsi="Wingdings" w:hint="default"/>
+      </w:rPr>
+    </w:lvl>
+    <w:lvl w:ilvl="3" w:tplc="04090001" w:tentative="1">
+      <w:start w:val="1"/>
+      <w:numFmt w:val="bullet"/>
+      <w:lvlText w:val=""/>
+      <w:lvlJc w:val="left"/>
+      <w:pPr>
+        <w:ind w:left="2880" w:hanging="360"/>
+      </w:pPr>
+      <w:rPr>
+        <w:rFonts w:ascii="Symbol" w:hAnsi="Symbol" w:hint="default"/>
+      </w:rPr>
+    </w:lvl>
+    <w:lvl w:ilvl="4" w:tplc="04090003" w:tentative="1">
+      <w:start w:val="1"/>
+      <w:numFmt w:val="bullet"/>
+      <w:lvlText w:val="o"/>
+      <w:lvlJc w:val="left"/>
+      <w:pPr>
+        <w:ind w:left="3600" w:hanging="360"/>
+      </w:pPr>
+      <w:rPr>
+        <w:rFonts w:ascii="Courier New" w:hAnsi="Courier New" w:cs="Courier New" w:hint="default"/>
+      </w:rPr>
+    </w:lvl>
+    <w:lvl w:ilvl="5" w:tplc="04090005" w:tentative="1">
+      <w:start w:val="1"/>
+      <w:numFmt w:val="bullet"/>
+      <w:lvlText w:val=""/>
+      <w:lvlJc w:val="left"/>
+      <w:pPr>
+        <w:ind w:left="4320" w:hanging="360"/>
+      </w:pPr>
+      <w:rPr>
+        <w:rFonts w:ascii="Wingdings" w:hAnsi="Wingdings" w:hint="default"/>
+      </w:rPr>
+    </w:lvl>
+    <w:lvl w:ilvl="6" w:tplc="04090001" w:tentative="1">
+      <w:start w:val="1"/>
+      <w:numFmt w:val="bullet"/>
+      <w:lvlText w:val=""/>
+      <w:lvlJc w:val="left"/>
+      <w:pPr>
+        <w:ind w:left="5040" w:hanging="360"/>
+      </w:pPr>
+      <w:rPr>
+        <w:rFonts w:ascii="Symbol" w:hAnsi="Symbol" w:hint="default"/>
+      </w:rPr>
+    </w:lvl>
+    <w:lvl w:ilvl="7" w:tplc="04090003" w:tentative="1">
+      <w:start w:val="1"/>
+      <w:numFmt w:val="bullet"/>
+      <w:lvlText w:val="o"/>
+      <w:lvlJc w:val="left"/>
+      <w:pPr>
+        <w:ind w:left="5760" w:hanging="360"/>
+      </w:pPr>
+      <w:rPr>
+        <w:rFonts w:ascii="Courier New" w:hAnsi="Courier New" w:cs="Courier New" w:hint="default"/>
+      </w:rPr>
+    </w:lvl>
+    <w:lvl w:ilvl="8" w:tplc="04090005" w:tentative="1">
+      <w:start w:val="1"/>
+      <w:numFmt w:val="bullet"/>
+      <w:lvlText w:val=""/>
+      <w:lvlJc w:val="left"/>
+      <w:pPr>
+        <w:ind w:left="6480" w:hanging="360"/>
+      </w:pPr>
+      <w:rPr>
+        <w:rFonts w:ascii="Wingdings" w:hAnsi="Wingdings" w:hint="default"/>
+      </w:rPr>
+    </w:lvl>
+  </w:abstractNum>
+  <w:abstractNum w:abstractNumId="9" w15:restartNumberingAfterBreak="0">
     <w:nsid w:val="53CB629B"/>
     <w:multiLevelType w:val="multilevel"/>
     <w:tmpl w:val="04090025"/>
@@ -4211,7 +4479,7 @@
       </w:pPr>
     </w:lvl>
   </w:abstractNum>
-  <w:abstractNum w:abstractNumId="6" w15:restartNumberingAfterBreak="0">
+  <w:abstractNum w:abstractNumId="10" w15:restartNumberingAfterBreak="0">
     <w:nsid w:val="59D33859"/>
     <w:multiLevelType w:val="hybridMultilevel"/>
     <w:tmpl w:val="1B003C54"/>
@@ -4300,7 +4568,7 @@
       </w:pPr>
     </w:lvl>
   </w:abstractNum>
-  <w:abstractNum w:abstractNumId="7" w15:restartNumberingAfterBreak="0">
+  <w:abstractNum w:abstractNumId="11" w15:restartNumberingAfterBreak="0">
     <w:nsid w:val="644D256F"/>
     <w:multiLevelType w:val="hybridMultilevel"/>
     <w:tmpl w:val="F05479FC"/>
@@ -4386,7 +4654,7 @@
       </w:pPr>
     </w:lvl>
   </w:abstractNum>
-  <w:abstractNum w:abstractNumId="8" w15:restartNumberingAfterBreak="0">
+  <w:abstractNum w:abstractNumId="12" w15:restartNumberingAfterBreak="0">
     <w:nsid w:val="67AC097B"/>
     <w:multiLevelType w:val="multilevel"/>
     <w:tmpl w:val="ED346578"/>
@@ -4502,7 +4770,7 @@
       </w:pPr>
     </w:lvl>
   </w:abstractNum>
-  <w:abstractNum w:abstractNumId="9" w15:restartNumberingAfterBreak="0">
+  <w:abstractNum w:abstractNumId="13" w15:restartNumberingAfterBreak="0">
     <w:nsid w:val="6D4839A7"/>
     <w:multiLevelType w:val="multilevel"/>
     <w:tmpl w:val="D164A45C"/>
@@ -4615,7 +4883,7 @@
       </w:pPr>
     </w:lvl>
   </w:abstractNum>
-  <w:abstractNum w:abstractNumId="10" w15:restartNumberingAfterBreak="0">
+  <w:abstractNum w:abstractNumId="14" w15:restartNumberingAfterBreak="0">
     <w:nsid w:val="6EE92CF1"/>
     <w:multiLevelType w:val="multilevel"/>
     <w:tmpl w:val="0409001F"/>
@@ -4701,7 +4969,7 @@
       </w:pPr>
     </w:lvl>
   </w:abstractNum>
-  <w:abstractNum w:abstractNumId="11" w15:restartNumberingAfterBreak="0">
+  <w:abstractNum w:abstractNumId="15" w15:restartNumberingAfterBreak="0">
     <w:nsid w:val="6FE44DAE"/>
     <w:multiLevelType w:val="multilevel"/>
     <w:tmpl w:val="83720A4E"/>
@@ -4814,7 +5082,7 @@
       </w:pPr>
     </w:lvl>
   </w:abstractNum>
-  <w:abstractNum w:abstractNumId="12" w15:restartNumberingAfterBreak="0">
+  <w:abstractNum w:abstractNumId="16" w15:restartNumberingAfterBreak="0">
     <w:nsid w:val="71E47902"/>
     <w:multiLevelType w:val="multilevel"/>
     <w:tmpl w:val="4D7C21BA"/>
@@ -4931,7 +5199,7 @@
       </w:pPr>
     </w:lvl>
   </w:abstractNum>
-  <w:abstractNum w:abstractNumId="13" w15:restartNumberingAfterBreak="0">
+  <w:abstractNum w:abstractNumId="17" w15:restartNumberingAfterBreak="0">
     <w:nsid w:val="7AA2694B"/>
     <w:multiLevelType w:val="multilevel"/>
     <w:tmpl w:val="ED346578"/>
@@ -5051,43 +5319,43 @@
     <w:abstractNumId w:val="0"/>
   </w:num>
   <w:num w:numId="2" w16cid:durableId="1353989785">
+    <w:abstractNumId w:val="15"/>
+  </w:num>
+  <w:num w:numId="3" w16cid:durableId="2044091490">
+    <w:abstractNumId w:val="6"/>
+  </w:num>
+  <w:num w:numId="4" w16cid:durableId="341133285">
+    <w:abstractNumId w:val="16"/>
+  </w:num>
+  <w:num w:numId="5" w16cid:durableId="1196962521">
+    <w:abstractNumId w:val="7"/>
+  </w:num>
+  <w:num w:numId="6" w16cid:durableId="114567207">
+    <w:abstractNumId w:val="13"/>
+  </w:num>
+  <w:num w:numId="7" w16cid:durableId="1891914410">
+    <w:abstractNumId w:val="2"/>
+  </w:num>
+  <w:num w:numId="8" w16cid:durableId="1925188722">
+    <w:abstractNumId w:val="3"/>
+  </w:num>
+  <w:num w:numId="9" w16cid:durableId="992831982">
+    <w:abstractNumId w:val="10"/>
+  </w:num>
+  <w:num w:numId="10" w16cid:durableId="1149856827">
+    <w:abstractNumId w:val="14"/>
+  </w:num>
+  <w:num w:numId="11" w16cid:durableId="642082101">
     <w:abstractNumId w:val="11"/>
   </w:num>
-  <w:num w:numId="3" w16cid:durableId="2044091490">
-    <w:abstractNumId w:val="3"/>
-  </w:num>
-  <w:num w:numId="4" w16cid:durableId="341133285">
+  <w:num w:numId="12" w16cid:durableId="1750034701">
     <w:abstractNumId w:val="12"/>
   </w:num>
-  <w:num w:numId="5" w16cid:durableId="1196962521">
-    <w:abstractNumId w:val="4"/>
-  </w:num>
-  <w:num w:numId="6" w16cid:durableId="114567207">
+  <w:num w:numId="13" w16cid:durableId="925306595">
     <w:abstractNumId w:val="9"/>
   </w:num>
-  <w:num w:numId="7" w16cid:durableId="1891914410">
-    <w:abstractNumId w:val="1"/>
-  </w:num>
-  <w:num w:numId="8" w16cid:durableId="1925188722">
-    <w:abstractNumId w:val="2"/>
-  </w:num>
-  <w:num w:numId="9" w16cid:durableId="992831982">
-    <w:abstractNumId w:val="6"/>
-  </w:num>
-  <w:num w:numId="10" w16cid:durableId="1149856827">
-    <w:abstractNumId w:val="10"/>
-  </w:num>
-  <w:num w:numId="11" w16cid:durableId="642082101">
-    <w:abstractNumId w:val="7"/>
-  </w:num>
-  <w:num w:numId="12" w16cid:durableId="1750034701">
-    <w:abstractNumId w:val="8"/>
-  </w:num>
-  <w:num w:numId="13" w16cid:durableId="925306595">
-    <w:abstractNumId w:val="5"/>
-  </w:num>
   <w:num w:numId="14" w16cid:durableId="226307567">
-    <w:abstractNumId w:val="10"/>
+    <w:abstractNumId w:val="14"/>
     <w:lvlOverride w:ilvl="0">
       <w:startOverride w:val="1"/>
     </w:lvlOverride>
@@ -5117,7 +5385,19 @@
     </w:lvlOverride>
   </w:num>
   <w:num w:numId="15" w16cid:durableId="1854881315">
-    <w:abstractNumId w:val="13"/>
+    <w:abstractNumId w:val="17"/>
+  </w:num>
+  <w:num w:numId="16" w16cid:durableId="1589391341">
+    <w:abstractNumId w:val="8"/>
+  </w:num>
+  <w:num w:numId="17" w16cid:durableId="921331973">
+    <w:abstractNumId w:val="5"/>
+  </w:num>
+  <w:num w:numId="18" w16cid:durableId="615258370">
+    <w:abstractNumId w:val="1"/>
+  </w:num>
+  <w:num w:numId="19" w16cid:durableId="804155122">
+    <w:abstractNumId w:val="4"/>
   </w:num>
 </w:numbering>
 </file>
@@ -5758,7 +6038,6 @@
   <w:style w:type="character" w:default="1" w:styleId="DefaultParagraphFont">
     <w:name w:val="Default Paragraph Font"/>
     <w:uiPriority w:val="1"/>
-    <w:semiHidden/>
     <w:unhideWhenUsed/>
   </w:style>
   <w:style w:type="table" w:default="1" w:styleId="TableNormal">

</xml_diff>